<commit_message>
Day 15-16 May 14-15 library management partially
</commit_message>
<xml_diff>
--- a/4th May.docx
+++ b/4th May.docx
@@ -207,10 +207,7 @@
         <w:t xml:space="preserve"> </w:t>
       </w:r>
       <w:r>
-        <w:t xml:space="preserve">same object </w:t>
-      </w:r>
-      <w:r>
-        <w:t>behaving differently in different environment</w:t>
+        <w:t>same object behaving differently in different environment</w:t>
       </w:r>
     </w:p>
     <w:p/>
@@ -219,6 +216,11 @@
         <w:t>Interface:</w:t>
       </w:r>
     </w:p>
+    <w:p/>
+    <w:p/>
+    <w:p/>
+    <w:p/>
+    <w:p/>
     <w:sectPr>
       <w:pgSz w:w="12240" w:h="15840"/>
       <w:pgMar w:top="1440" w:right="1440" w:bottom="1440" w:left="1440" w:header="720" w:footer="720" w:gutter="0"/>

</xml_diff>